<commit_message>
Afirma a DIRPLA como área gestora na Nota Técnica e no Despacho
Co-Authored-By: Claude Sonnet 5.5 <noreply@anthropic.com>
Claude-Session: https://claude.ai/code/session_019hKSviCnF5ihoMnErm9Cu3
</commit_message>
<xml_diff>
--- a/Despacho_ASSGER_Orientacao_TED.docx
+++ b/Despacho_ASSGER_Orientacao_TED.docx
@@ -232,7 +232,7 @@
           <w:sz w:val="20"/>
           <w:szCs w:val="20"/>
         </w:rPr>
-        <w:t xml:space="preserve">Sugere-se que a Diretoria Executiva designe a DIRPLA, com base no art. 54, I e VI, e no art. 56 do Regimento Interno, tendo a DIRAF, a DIREO e as demais áreas concedentes e executantes como corresponsáveis. A decisão deve registrar a base de competência.</w:t>
+        <w:t xml:space="preserve">A área gestora é a DIRPLA, com base no art. 54, I e VI, e no art. 56 do Regimento Interno, tendo a DIRAF, a DIREO e as demais áreas concedentes e executantes como corresponsáveis. Recomenda-se que a Diretoria Executiva registre essa definição, com a base de competência.</w:t>
       </w:r>
     </w:p>
     <w:p>
@@ -313,7 +313,7 @@
           <w:sz w:val="20"/>
           <w:szCs w:val="20"/>
         </w:rPr>
-        <w:t xml:space="preserve">Os pontos que dependem de decisão da Diretoria Executiva, da ASSJUR, do Conselho de Administração e da CGE estão na seção 9 da Nota Técnica. Sugere-se o encaminhamento do processo à Diretoria Executiva, para a reunião que definirá a unidade responsável pela norma.</w:t>
+        <w:t xml:space="preserve">Os pontos que dependem de decisão da Diretoria Executiva, da ASSJUR, do Conselho de Administração e da CGE estão na seção 9 da Nota Técnica. Sugere-se o encaminhamento do processo à Diretoria Executiva, para registrar a definição da área gestora na reunião prevista.</w:t>
       </w:r>
     </w:p>
     <w:p>

</xml_diff>